<commit_message>
docs: manual do utilizador e limpeza da pasta do projeto
Remove pasta entrega e scripts pontuais; adiciona MANUAL_UTILIZADOR.md; simplifica README e tools.

Co-authored-by: Cursor <cursoragent@cursor.com>
</commit_message>
<xml_diff>
--- a/word/StockTracker_Documentacao_Projeto.docx
+++ b/word/StockTracker_Documentacao_Projeto.docx
@@ -1712,7 +1712,7 @@
         <w:pStyle w:val="Heading2"/>
       </w:pPr>
       <w:r>
-        <w:t>2.9 Fase 5 — Versao de entrega do estagio (v2.1)</w:t>
+        <w:t>2.9 Versao 2.1 — funcionalidades adicionais</w:t>
       </w:r>
     </w:p>
     <w:p>
@@ -1720,7 +1720,7 @@
         <w:rPr>
           <w:b/>
         </w:rPr>
-        <w:t>Iteracao final do estagio Siemens: passivos em massa, estatisticas, relatorios PDF, pesquisa global e emprestimos de equipamentos.</w:t>
+        <w:t>Passivos em massa, estatisticas, relatorios PDF, pesquisa global e emprestimos de equipamentos.</w:t>
       </w:r>
     </w:p>
     <w:p>
@@ -1736,7 +1736,7 @@
         <w:pStyle w:val="ListBullet"/>
       </w:pPr>
       <w:r>
-        <w:t>Pagina Statistics (Ctrl+3) — stock baixo, calibracoes, localizacoes, export PDF.</w:t>
+        <w:t>Pagina Statistics (Ctrl+3) — stock baixo, calibracoes, export PDF.</w:t>
       </w:r>
     </w:p>
     <w:p>
@@ -1744,7 +1744,7 @@
         <w:pStyle w:val="ListBullet"/>
       </w:pPr>
       <w:r>
-        <w:t>Pesquisa global Ctrl+G — Components + Passive + Equipments.</w:t>
+        <w:t>Pesquisa global Ctrl+G.</w:t>
       </w:r>
     </w:p>
     <w:p>
@@ -1752,7 +1752,7 @@
         <w:pStyle w:val="ListBullet"/>
       </w:pPr>
       <w:r>
-        <w:t>Empréstimos de equipamentos — folha EquipmentLoans + dialogo dedicado.</w:t>
+        <w:t>Emprestimos de equipamentos (folha EquipmentLoans).</w:t>
       </w:r>
     </w:p>
     <w:p>
@@ -1760,7 +1760,7 @@
         <w:pStyle w:val="ListBullet"/>
       </w:pPr>
       <w:r>
-        <w:t>Alertas de calibracao por email (configuravel).</w:t>
+        <w:t>Alertas de calibracao por email.</w:t>
       </w:r>
     </w:p>
     <w:p>
@@ -1768,7 +1768,7 @@
         <w:pStyle w:val="ListBullet"/>
       </w:pPr>
       <w:r>
-        <w:t>Localizacao opcional ao adicionar stock; multi-location nos componentes.</w:t>
+        <w:t>Localizacao nos componentes e passivos; Package automatico no Passive.</w:t>
       </w:r>
     </w:p>
     <w:p>
@@ -1776,31 +1776,7 @@
         <w:pStyle w:val="ListBullet"/>
       </w:pPr>
       <w:r>
-        <w:t>Package automatico no dialogo Passive a partir da Supplier Ref (catalogo).</w:t>
-      </w:r>
-    </w:p>
-    <w:p>
-      <w:pPr>
-        <w:pStyle w:val="ListBullet"/>
-      </w:pPr>
-      <w:r>
-        <w:t>Last 20 com selecao e abertura do item (Components, Passive, Equipments).</w:t>
-      </w:r>
-    </w:p>
-    <w:p>
-      <w:pPr>
-        <w:pStyle w:val="ListBullet"/>
-      </w:pPr>
-      <w:r>
-        <w:t>INSTALAR.bat e tools/verificar_entrega.py para entrega ao receptor.</w:t>
-      </w:r>
-    </w:p>
-    <w:p>
-      <w:pPr>
-        <w:pStyle w:val="ListBullet"/>
-      </w:pPr>
-      <w:r>
-        <w:t>Pacote docs/entrega/ — checklist e documentacao de entrega Siemens.</w:t>
+        <w:t>INSTALAR.bat e manual em docs/guias/MANUAL_UTILIZADOR.md.</w:t>
       </w:r>
     </w:p>
     <w:p>

</xml_diff>